<commit_message>
feat(editions): liste des creneaux ouverts — totaux et rupture par demandeur
Co-Authored-By: Claude Fable 5 <noreply@anthropic.com>
</commit_message>
<xml_diff>
--- a/docs/Guide-utilisation.docx
+++ b/docs/Guide-utilisation.docx
@@ -1781,7 +1781,17 @@
         <w:t xml:space="preserve">liste des inscrits</w:t>
       </w:r>
       <w:r>
-        <w:t xml:space="preserve"> (les usagers ayant réservé sur l'exercice — identité, structure, niveau et contact ; les comptes anonymisés sont masqués par défaut), le tableau de </w:t>
+        <w:t xml:space="preserve"> (les usagers ayant réservé sur l'exercice — identité, structure, niveau et contact ; les comptes anonymisés sont masqués par défaut), la </w:t>
+      </w:r>
+      <w:r>
+        <w:rPr>
+          <w:b/>
+          <w:bCs/>
+        </w:rPr>
+        <w:t xml:space="preserve">liste des créneaux ouverts</w:t>
+      </w:r>
+      <w:r>
+        <w:t xml:space="preserve"> (l'offre de réservation du service : jour, horaires, type, période, places et demandeurs de chaque créneau, avec total et rupture par demandeur), le tableau de </w:t>
       </w:r>
       <w:r>
         <w:rPr>

</xml_diff>

<commit_message>
feat(editions): inscrits — date d inscription, tri par en-tetes, exports CSV inscrits/creneaux
Co-Authored-By: Claude Fable 5 <noreply@anthropic.com>
</commit_message>
<xml_diff>
--- a/docs/Guide-utilisation.docx
+++ b/docs/Guide-utilisation.docx
@@ -1781,7 +1781,17 @@
         <w:t xml:space="preserve">liste des inscrits</w:t>
       </w:r>
       <w:r>
-        <w:t xml:space="preserve"> (les usagers ayant réservé sur l'exercice — identité, structure, niveau et contact ; les comptes anonymisés sont masqués par défaut), la </w:t>
+        <w:t xml:space="preserve"> (les usagers ayant réservé sur l'exercice — identité, structure, niveau, contact et date d'inscription ; tableau </w:t>
+      </w:r>
+      <w:r>
+        <w:rPr>
+          <w:b/>
+          <w:bCs/>
+        </w:rPr>
+        <w:t xml:space="preserve">triable par clic sur les en-têtes de colonnes</w:t>
+      </w:r>
+      <w:r>
+        <w:t xml:space="preserve"> ; les comptes anonymisés sont masqués par défaut), la </w:t>
       </w:r>
       <w:r>
         <w:rPr>
@@ -1801,17 +1811,7 @@
         <w:t xml:space="preserve">toutes les réservations</w:t>
       </w:r>
       <w:r>
-        <w:t xml:space="preserve"> (période, date, créneau, demandeur, participant, thème, nombre d'enfants, statut, pointage) avec </w:t>
-      </w:r>
-      <w:r>
-        <w:rPr>
-          <w:b/>
-          <w:bCs/>
-        </w:rPr>
-        <w:t xml:space="preserve">export CSV</w:t>
-      </w:r>
-      <w:r>
-        <w:t xml:space="preserve">, une vue </w:t>
+        <w:t xml:space="preserve"> (période, date, créneau, demandeur, participant, thème, nombre d'enfants, statut, pointage), une vue </w:t>
       </w:r>
       <w:r>
         <w:rPr>
@@ -1839,6 +1839,16 @@
           <w:bCs/>
         </w:rPr>
         <w:t xml:space="preserve">PDF</w:t>
+      </w:r>
+      <w:r>
+        <w:t xml:space="preserve">, et les listes (inscrits, créneaux ouverts, réservations) s'exportent en </w:t>
+      </w:r>
+      <w:r>
+        <w:rPr>
+          <w:b/>
+          <w:bCs/>
+        </w:rPr>
+        <w:t xml:space="preserve">CSV</w:t>
       </w:r>
       <w:r>
         <w:t xml:space="preserve">.</w:t>

</xml_diff>

<commit_message>
feat(agenda admin): glisser une reservation vers une autre semaine ou periode
- Pendant un glisser HTML5 de reservation, survoler les fleches ◂ ▸, les bords
  gauche/droit de la grille (bandes de 28 px, accent en transparence) ou un
  onglet de periode fait defiler la semaine / bascule de periode apres un court
  delai (repetition sur fleches et bords) ; le depot se fait ensuite dans la
  semaine atteinte avec les regles existantes.
- Repli de fin de glisser : le badge source demonte par le changement de
  semaine ne remonte plus dragend → premier mousemove = fin du geste.
- Fiche reservation : champ date du signalement d absence en var(--muted)
  quand la case est decochee.
- Guide (astuce de l agenda) + livrables regeneres.

Co-Authored-By: Claude Fable 5.1 <noreply@anthropic.com>
</commit_message>
<xml_diff>
--- a/docs/Guide-utilisation.docx
+++ b/docs/Guide-utilisation.docx
@@ -1908,7 +1908,37 @@
         <w:ind w:left="240"/>
       </w:pPr>
       <w:r>
-        <w:t xml:space="preserve">💡 Astuce : cliquez sur un créneau vide pour ajouter une réservation, ou glissez une réservation vers un autre créneau pour la déplacer.</w:t>
+        <w:t xml:space="preserve">💡 Astuce : cliquez sur un créneau vide pour ajouter une réservation, ou glissez une réservation vers un autre créneau pour la déplacer. Pour la déposer dans une </w:t>
+      </w:r>
+      <w:r>
+        <w:rPr>
+          <w:b/>
+          <w:bCs/>
+        </w:rPr>
+        <w:t xml:space="preserve">autre semaine</w:t>
+      </w:r>
+      <w:r>
+        <w:t xml:space="preserve">, survolez la flèche ◂ ou ▸, ou le </w:t>
+      </w:r>
+      <w:r>
+        <w:rPr>
+          <w:b/>
+          <w:bCs/>
+        </w:rPr>
+        <w:t xml:space="preserve">bord gauche ou droit</w:t>
+      </w:r>
+      <w:r>
+        <w:t xml:space="preserve"> de la grille, pendant le glisser : l'agenda change de semaine, puis déposez la réservation. Survoler un </w:t>
+      </w:r>
+      <w:r>
+        <w:rPr>
+          <w:b/>
+          <w:bCs/>
+        </w:rPr>
+        <w:t xml:space="preserve">onglet de période</w:t>
+      </w:r>
+      <w:r>
+        <w:t xml:space="preserve"> bascule de même sur cette période.</w:t>
       </w:r>
     </w:p>
     <w:p>

</xml_diff>

<commit_message>
feat(mon-compte): categorie / structure dans le meme formulaire que l identite, un seul Enregistrer
- profile-form : formulaire separe et bouton « Enregistrer categorie / structure » supprimes ; selecteurs (cascade, saisie libre) ou version figee dans le bloc sous l identite, niveau en lecture seule sur la meme ligne
- actions : updateAffiliationAction devient l etape interne applyAffiliation d updateProfileAction (memes controles + audit), appliquee avant l identite
- guide « Mon profil » mis a jour, artefacts regeneres
- shells : fragments inutiles retires (Biome)

Co-Authored-By: Claude Fable 5.1 <noreply@anthropic.com>
</commit_message>
<xml_diff>
--- a/docs/Guide-utilisation.docx
+++ b/docs/Guide-utilisation.docx
@@ -743,7 +743,7 @@
         <w:t xml:space="preserve">Mon profil</w:t>
       </w:r>
       <w:r>
-        <w:t xml:space="preserve"> — nom, prénom, e-mail, téléphone.</w:t>
+        <w:t xml:space="preserve"> — nom, prénom, téléphone, nombre d'enfants et d'accompagnants, catégorie et structure (un seul bouton « Enregistrer » ; catégorie et structure restent modifiables tant que vous n'avez aucune réservation sur l'exercice en cours).</w:t>
       </w:r>
     </w:p>
     <w:p>
@@ -2860,7 +2860,7 @@
         <w:t xml:space="preserve">absences prévenues</w:t>
       </w:r>
       <w:r>
-        <w:t xml:space="preserve"> (l'usager peut signaler depuis son agenda qu'il sera absent à une séance, le gestionnaire l'enregistrer dans la fiche de réservation ; désactivé par défaut), </w:t>
+        <w:t xml:space="preserve"> (l'usager peut signaler depuis son agenda qu'il sera absent à une séance, le gestionnaire l'enregistrer dans la fiche de réservation ; activé par défaut), </w:t>
       </w:r>
       <w:r>
         <w:rPr>
@@ -2870,7 +2870,7 @@
         <w:t xml:space="preserve">liste d'attente</w:t>
       </w:r>
       <w:r>
-        <w:t xml:space="preserve"> (l'usager dépose ses disponibilités par demi-journée et est prévenu par e-mail, ou inscrit automatiquement, dès qu'un créneau se libère ; désactivé par défaut) et </w:t>
+        <w:t xml:space="preserve"> (l'usager dépose ses disponibilités par demi-journée et est prévenu par e-mail, ou inscrit automatiquement, dès qu'un créneau se libère ; activé par défaut) et </w:t>
       </w:r>
       <w:r>
         <w:rPr>

</xml_diff>

<commit_message>
feat(e-mails): destinataire « gestionnaires » = e-mail de contact du service s il est renseigne, sinon les comptes gestionnaire
- serviceManagerRecipients (mail-prefs) partage par les declencheurs et les recapitulatifs (manager-notice) ; comptes anonymises exclus
- libelle Echanges « Le service (e-mail de contact, sinon ses gestionnaires) », guide, commentaire schema

Co-Authored-By: Claude Fable 5.1 <noreply@anthropic.com>
</commit_message>
<xml_diff>
--- a/docs/Guide-utilisation.docx
+++ b/docs/Guide-utilisation.docx
@@ -1962,7 +1962,7 @@
         <w:t xml:space="preserve">Absence prévenue</w:t>
       </w:r>
       <w:r>
-        <w:t xml:space="preserve"> (si activée dans Paramètres › Configuration) : un usager peut signaler à l'avance, depuis son agenda, qu'il sera absent à une séance (les gestionnaires du service en sont informés par e-mail). Un gestionnaire prévenu par un autre canal l'enregistre lui-même dans la </w:t>
+        <w:t xml:space="preserve"> (si activée dans Paramètres › Configuration) : un usager peut signaler à l'avance, depuis son agenda, qu'il sera absent à une séance (le service en est informé par e-mail : à son e-mail de contact s'il est renseigné, sinon à ses gestionnaires). Un gestionnaire prévenu par un autre canal l'enregistre lui-même dans la </w:t>
       </w:r>
       <w:r>
         <w:rPr>
@@ -3408,7 +3408,7 @@
         <w:t xml:space="preserve">maisondesarts@chatillon92.fr</w:t>
       </w:r>
       <w:r>
-        <w:t xml:space="preserve">) proposé aux usagers quand plus aucune place n'est disponible.</w:t>
+        <w:t xml:space="preserve">) proposé aux usagers quand plus aucune place n'est disponible ; s'il est renseigné, c'est aussi lui qui reçoit les e-mails adressés au service (absences prévenues, récapitulatifs de réservations, déclencheurs réglés sur « gestionnaires ») à la place des comptes gestionnaire rattachés.</w:t>
       </w:r>
     </w:p>
     <w:p>
@@ -4250,7 +4250,7 @@
         <w:t xml:space="preserve">Validation automatique</w:t>
       </w:r>
       <w:r>
-        <w:t xml:space="preserve"> des réservations après un délai paramétré, avec récapitulatif envoyé aux gestionnaires.</w:t>
+        <w:t xml:space="preserve"> des réservations après un délai paramétré, avec récapitulatif envoyé au service (à son e-mail de contact s'il est renseigné, sinon à ses gestionnaires).</w:t>
       </w:r>
     </w:p>
     <w:p>

</xml_diff>

<commit_message>
feat(admin): Utilisateurs en sous-onglets Comptes / Connectes — sessions valides (politique d inactivite) par compte, sans IP, deconnexion forcee journalisee
- layout + sous-navigation ; /users → /users/comptes (ancien contenu, dans un panneau)
- Connectes : lib/connected-users (pure + tests) — filtre checkSessionPolicy, actif = action < 5 min, appareils depuis le user-agent ; rafraichissement 30 s
- disconnectUserAction (toutes les sessions du compte, pas le sien) + audit user.sessions_revoked (mis en evidence dans le Journal)
- guide, onboarding admin

Co-Authored-By: Claude Fable 5.1 <noreply@anthropic.com>
</commit_message>
<xml_diff>
--- a/docs/Guide-utilisation.docx
+++ b/docs/Guide-utilisation.docx
@@ -3507,7 +3507,17 @@
         <w:spacing w:after="160"/>
       </w:pPr>
       <w:r>
-        <w:t xml:space="preserve">La liste des utilisateurs permet de rechercher, filtrer et modifier les comptes : informations, </w:t>
+        <w:t xml:space="preserve">L'onglet a deux sous-onglets. </w:t>
+      </w:r>
+      <w:r>
+        <w:rPr>
+          <w:b/>
+          <w:bCs/>
+        </w:rPr>
+        <w:t xml:space="preserve">« Comptes »</w:t>
+      </w:r>
+      <w:r>
+        <w:t xml:space="preserve"> : la liste des utilisateurs permet de rechercher, filtrer et modifier les comptes : informations, </w:t>
       </w:r>
       <w:r>
         <w:rPr>
@@ -3518,6 +3528,31 @@
       </w:r>
       <w:r>
         <w:t xml:space="preserve"> (utilisateur, gestionnaire, administrateur), structure / service rattaché, services gérés et statut RGPD.</w:t>
+      </w:r>
+    </w:p>
+    <w:p>
+      <w:pPr>
+        <w:spacing w:after="160"/>
+      </w:pPr>
+      <w:r>
+        <w:rPr>
+          <w:b/>
+          <w:bCs/>
+        </w:rPr>
+        <w:t xml:space="preserve">« Connectés »</w:t>
+      </w:r>
+      <w:r>
+        <w:t xml:space="preserve"> liste les comptes dont une session est encore valide au sens de la déconnexion automatique (2 h sans action pour un usager, 15 min pour un gestionnaire ou un administrateur, plafond de 24 h ou 8 h), avec leur dernière action (pastille verte dans les 5 dernières minutes, orange au-delà), la date de connexion, les appareils et le nombre de sessions ; le tableau se rafraîchit toutes les 30 secondes. </w:t>
+      </w:r>
+      <w:r>
+        <w:rPr>
+          <w:b/>
+          <w:bCs/>
+        </w:rPr>
+        <w:t xml:space="preserve">« Déconnecter »</w:t>
+      </w:r>
+      <w:r>
+        <w:t xml:space="preserve"> révoque toutes les sessions d'un compte sur tous ses appareils (poste resté ouvert…) et laisse une trace dans le Journal. Aucune adresse IP n'est affichée.</w:t>
       </w:r>
     </w:p>
     <w:p>

</xml_diff>

<commit_message>
style(utilisateurs): refonte des onglets Comptes / Connectes
- colonne unique « Compte » (avatar a initiales teinte par role, nom, e-mail), pastilles Statut (Confirme / En attente / Anonymise) et Role, pictogramme d affiliation
- puces de filtre (Tous, Utilisateurs, Gestionnaires, Administrateurs, Non confirmes, Anonymises) avec effectifs ; recherche etendue aux structures et services ; recherche + Ajouter en bloc a droite, « + » seul en fenetre etroite
- actions de ligne au survol : crayon (modifier), fleche (export RGPD), personne barree (anonymiser), avion (renvoyer le mail de confirmation) — SVG inline, plus d emoji dans la barre d actions
- en-tete clair sans bandeau vert, filets fins, lignes de 37 px, lignes vides sans filet (trait de fin seul), 15 comptes par page
- Connectes : meme style, bouton Deconnecter en pictogramme
- briques partagees users/account-ui.tsx, CSS .acct-* ; guide mis a jour

Co-Authored-By: Claude Fable 5.1 <noreply@anthropic.com>
</commit_message>
<xml_diff>
--- a/docs/Guide-utilisation.docx
+++ b/docs/Guide-utilisation.docx
@@ -3655,7 +3655,7 @@
         <w:t xml:space="preserve">« Comptes »</w:t>
       </w:r>
       <w:r>
-        <w:t xml:space="preserve"> : la liste des utilisateurs permet de rechercher, filtrer et modifier les comptes : informations, </w:t>
+        <w:t xml:space="preserve"> : la liste des utilisateurs permet de rechercher (nom, e-mail, structure), filtrer et modifier les comptes : informations, </w:t>
       </w:r>
       <w:r>
         <w:rPr>
@@ -3665,7 +3665,77 @@
         <w:t xml:space="preserve">rôle</w:t>
       </w:r>
       <w:r>
-        <w:t xml:space="preserve"> (utilisateur, gestionnaire, administrateur), structure / service rattaché, services gérés et statut RGPD.</w:t>
+        <w:t xml:space="preserve"> (utilisateur, gestionnaire, administrateur), structure / service rattaché, services gérés et statut RGPD. Des </w:t>
+      </w:r>
+      <w:r>
+        <w:rPr>
+          <w:b/>
+          <w:bCs/>
+        </w:rPr>
+        <w:t xml:space="preserve">filtres rapides</w:t>
+      </w:r>
+      <w:r>
+        <w:t xml:space="preserve"> au-dessus du tableau isolent une population avec son effectif : tous, utilisateurs, gestionnaires, administrateurs, </w:t>
+      </w:r>
+      <w:r>
+        <w:rPr>
+          <w:b/>
+          <w:bCs/>
+        </w:rPr>
+        <w:t xml:space="preserve">non confirmés</w:t>
+      </w:r>
+      <w:r>
+        <w:t xml:space="preserve">, anonymisés. Chaque ligne montre l'avatar et l'e-mail du compte, son </w:t>
+      </w:r>
+      <w:r>
+        <w:rPr>
+          <w:b/>
+          <w:bCs/>
+        </w:rPr>
+        <w:t xml:space="preserve">statut</w:t>
+      </w:r>
+      <w:r>
+        <w:t xml:space="preserve"> — « Confirmé » (adresse e-mail confirmée), « En attente » (le compte ne peut pas encore se connecter) ou « Anonymisé » — son rôle et son affiliation. Les actions apparaissent au survol de la ligne : </w:t>
+      </w:r>
+      <w:r>
+        <w:rPr>
+          <w:b/>
+          <w:bCs/>
+        </w:rPr>
+        <w:t xml:space="preserve">modifier la fiche</w:t>
+      </w:r>
+      <w:r>
+        <w:t xml:space="preserve"> (crayon), </w:t>
+      </w:r>
+      <w:r>
+        <w:rPr>
+          <w:b/>
+          <w:bCs/>
+        </w:rPr>
+        <w:t xml:space="preserve">exporter les données</w:t>
+      </w:r>
+      <w:r>
+        <w:t xml:space="preserve"> RGPD (flèche), </w:t>
+      </w:r>
+      <w:r>
+        <w:rPr>
+          <w:b/>
+          <w:bCs/>
+        </w:rPr>
+        <w:t xml:space="preserve">anonymiser</w:t>
+      </w:r>
+      <w:r>
+        <w:t xml:space="preserve"> (personne barrée) et, pour un compte en attente, </w:t>
+      </w:r>
+      <w:r>
+        <w:rPr>
+          <w:b/>
+          <w:bCs/>
+        </w:rPr>
+        <w:t xml:space="preserve">renvoyer le mail de confirmation</w:t>
+      </w:r>
+      <w:r>
+        <w:t xml:space="preserve"> (avion). La case à cocher ouvre la barre d'actions du bas pour les opérations rares (suppression d'un compte vide, réinitialisation de la double authentification).</w:t>
       </w:r>
     </w:p>
     <w:p>

</xml_diff>

<commit_message>
docs: 15 captures du guide refaites (personnes reelles et config SMTP floutees) ; Comptes sans case a cocher
- scripts/capture-doc-shots.mjs : une section par figure (01 a 15) + onboarding, filtre CAPTURE_ONLY, floutage automatique des personnes reelles (liste produite par scripts/capture-blur-list.ts dans .capture-blur.json, ignore) et des champs SMTP
- Comptes : plus de case a cocher ni de barre d actions ; cle (reinit. 2FA) et corbeille (compte vide) rejoignent les actions de ligne
- legende de la figure 7 (index des editions), guide et artefacts regeneres

Co-Authored-By: Claude Fable 5.1 <noreply@anthropic.com>
</commit_message>
<xml_diff>
--- a/docs/Guide-utilisation.docx
+++ b/docs/Guide-utilisation.docx
@@ -2482,7 +2482,7 @@
           <w:sz w:val="18"/>
           <w:szCs w:val="18"/>
         </w:rPr>
-        <w:t xml:space="preserve">Figure 7 — Liste des réservations (Éditions) et export CSV</w:t>
+        <w:t xml:space="preserve">Figure 7 — Onglet Éditions d'un service : éditions et liste d'attente</w:t>
       </w:r>
     </w:p>
     <w:p>
@@ -3725,7 +3725,7 @@
         <w:t xml:space="preserve">anonymiser</w:t>
       </w:r>
       <w:r>
-        <w:t xml:space="preserve"> (personne barrée) et, pour un compte en attente, </w:t>
+        <w:t xml:space="preserve"> (personne barrée), et selon le compte : </w:t>
       </w:r>
       <w:r>
         <w:rPr>
@@ -3735,7 +3735,27 @@
         <w:t xml:space="preserve">renvoyer le mail de confirmation</w:t>
       </w:r>
       <w:r>
-        <w:t xml:space="preserve"> (avion). La case à cocher ouvre la barre d'actions du bas pour les opérations rares (suppression d'un compte vide, réinitialisation de la double authentification).</w:t>
+        <w:t xml:space="preserve"> (avion, compte en attente), </w:t>
+      </w:r>
+      <w:r>
+        <w:rPr>
+          <w:b/>
+          <w:bCs/>
+        </w:rPr>
+        <w:t xml:space="preserve">réinitialiser la double authentification</w:t>
+      </w:r>
+      <w:r>
+        <w:t xml:space="preserve"> (clé, second facteur actif) ou </w:t>
+      </w:r>
+      <w:r>
+        <w:rPr>
+          <w:b/>
+          <w:bCs/>
+        </w:rPr>
+        <w:t xml:space="preserve">supprimer définitivement</w:t>
+      </w:r>
+      <w:r>
+        <w:t xml:space="preserve"> (corbeille, compte sans aucune réservation : test, spam).</w:t>
       </w:r>
     </w:p>
     <w:p>

</xml_diff>

<commit_message>
style(rgpd): refonte du panneau Conservation des donnees et du journal d audit
- parcours en 3 etapes (inactivite toleree / preavis / anonymisation) + reglages sur une ligne
- liste des comptes groupee (au-dela du seuil / actifs), jauge d inactivite avec repere de seuil,
  colonne Preavis vide pour les comptes actifs, actions par ligne (export, preavis, anonymisation)
- a l etroit : la colonne Derniere activite disparait (container query), sans ascenseur horizontal
- journal d audit en frise par jour, filtres par famille, IP conservee dans le CSV seulement
- guide : paragraphe RGPD reecrit, figure 15 recapturee, documents regeneres

Co-Authored-By: Claude Fable 5.1 <noreply@anthropic.com>
</commit_message>
<xml_diff>
--- a/docs/Guide-utilisation.docx
+++ b/docs/Guide-utilisation.docx
@@ -4145,37 +4145,37 @@
         <w:t xml:space="preserve">RGPD</w:t>
       </w:r>
       <w:r>
-        <w:t xml:space="preserve"> permet de repérer les </w:t>
-      </w:r>
-      <w:r>
-        <w:rPr>
-          <w:b/>
-          <w:bCs/>
-        </w:rPr>
-        <w:t xml:space="preserve">comptes inactifs</w:t>
-      </w:r>
-      <w:r>
-        <w:t xml:space="preserve">, de déclencher un </w:t>
-      </w:r>
-      <w:r>
-        <w:rPr>
-          <w:b/>
-          <w:bCs/>
-        </w:rPr>
-        <w:t xml:space="preserve">avis de suppression</w:t>
-      </w:r>
-      <w:r>
-        <w:t xml:space="preserve"> (délai de grâce de 30 jours), d'</w:t>
-      </w:r>
-      <w:r>
-        <w:rPr>
-          <w:b/>
-          <w:bCs/>
-        </w:rPr>
-        <w:t xml:space="preserve">anonymiser</w:t>
-      </w:r>
-      <w:r>
-        <w:t xml:space="preserve"> des comptes et de consulter le </w:t>
+        <w:t xml:space="preserve"> présente la </w:t>
+      </w:r>
+      <w:r>
+        <w:rPr>
+          <w:b/>
+          <w:bCs/>
+        </w:rPr>
+        <w:t xml:space="preserve">conservation des données</w:t>
+      </w:r>
+      <w:r>
+        <w:t xml:space="preserve"> en trois étapes : inactivité tolérée (seuil en années), </w:t>
+      </w:r>
+      <w:r>
+        <w:rPr>
+          <w:b/>
+          <w:bCs/>
+        </w:rPr>
+        <w:t xml:space="preserve">préavis</w:t>
+      </w:r>
+      <w:r>
+        <w:t xml:space="preserve"> de suppression par e-mail, puis </w:t>
+      </w:r>
+      <w:r>
+        <w:rPr>
+          <w:b/>
+          <w:bCs/>
+        </w:rPr>
+        <w:t xml:space="preserve">anonymisation</w:t>
+      </w:r>
+      <w:r>
+        <w:t xml:space="preserve"> passé le délai de grâce (30 jours par défaut), avec l'effectif de comptes à chaque étape. Les comptes sont regroupés — « Au-delà du seuil » d'abord, puis « Actifs » — avec une jauge d'inactivité rapportée au seuil et, au survol, les actions : export des données, envoi du préavis, anonymisation. Le </w:t>
       </w:r>
       <w:r>
         <w:rPr>
@@ -4185,7 +4185,7 @@
         <w:t xml:space="preserve">journal d'audit</w:t>
       </w:r>
       <w:r>
-        <w:t xml:space="preserve"> (historique immuable des actions liées aux données personnelles).</w:t>
+        <w:t xml:space="preserve"> (historique immuable des actions liées aux données personnelles) se lit en frise chronologique par jour, filtrable par nature d'action, et s'exporte en CSV.</w:t>
       </w:r>
     </w:p>
     <w:p>

</xml_diff>

<commit_message>
style(rgpd service): refonte de Parametres > RGPD dans la famille graphique de l onglet admin
- en-tete bouclier + pastille « au-dela du seuil » + recherche (bloc a droite, se replie sous le titre)
- deux cartes de droits (export art. 15 / anonymisation art. 17) a la place du logo et du paragraphe
- liste avatar + derniere activite + jauge d inactivite + actions en pictogrammes ; 3 colonnes a l etroit
- pied : compteur, pagination, seuil en vigueur, renvoi vers Administration > RGPD
- format des durees et jauge extraits dans rgpd/inactivity-format.ts (partages avec le panneau admin)
- public/RGPD.png supprime (plus reference)
- guide : paragraphe Parametres > RGPD reecrit, documents regeneres

Co-Authored-By: Claude Fable 5.1 <noreply@anthropic.com>
</commit_message>
<xml_diff>
--- a/docs/Guide-utilisation.docx
+++ b/docs/Guide-utilisation.docx
@@ -3417,7 +3417,47 @@
         <w:t xml:space="preserve">limitée aux usagers rattachés au service</w:t>
       </w:r>
       <w:r>
-        <w:t xml:space="preserve"> : repérer les comptes inactifs concernés. Le pilotage RGPD global (avis de suppression, anonymisation, journal d'audit) reste dans </w:t>
+        <w:t xml:space="preserve">. Deux cartes rappellent les droits exerçables ici : </w:t>
+      </w:r>
+      <w:r>
+        <w:rPr>
+          <w:b/>
+          <w:bCs/>
+        </w:rPr>
+        <w:t xml:space="preserve">Exporter</w:t>
+      </w:r>
+      <w:r>
+        <w:t xml:space="preserve"> (droit d'accès, article 15 : profil + historique des réservations, téléchargement JSON) et </w:t>
+      </w:r>
+      <w:r>
+        <w:rPr>
+          <w:b/>
+          <w:bCs/>
+        </w:rPr>
+        <w:t xml:space="preserve">Anonymiser</w:t>
+      </w:r>
+      <w:r>
+        <w:t xml:space="preserve"> (droit à l'effacement, article 17 : nom, prénom, e-mail et téléphone vidés, compte verrouillé, réservations conservées ; irréversible). La liste présente chaque usager avec sa dernière activité et une </w:t>
+      </w:r>
+      <w:r>
+        <w:rPr>
+          <w:b/>
+          <w:bCs/>
+        </w:rPr>
+        <w:t xml:space="preserve">jauge d'inactivité</w:t>
+      </w:r>
+      <w:r>
+        <w:t xml:space="preserve"> graduée sur le seuil de rétention ; une pastille signale les comptes </w:t>
+      </w:r>
+      <w:r>
+        <w:rPr>
+          <w:b/>
+          <w:bCs/>
+        </w:rPr>
+        <w:t xml:space="preserve">au-delà du seuil</w:t>
+      </w:r>
+      <w:r>
+        <w:t xml:space="preserve">. Les actions se lancent depuis la ligne (flèche = exporter, personne barrée = anonymiser). Le pilotage RGPD global (préavis, anonymisation en masse, journal d'audit) reste dans </w:t>
       </w:r>
       <w:r>
         <w:t xml:space="preserve">Administration → RGPD</w:t>

</xml_diff>

<commit_message>
style(journal): refonte du Journal des actions privilegiees en frise par jour
- frise chronologique par jour (meme construction que le journal RGPD), heure,
  pictogramme SVG teinte par portee de l acte, libelle + detail, acteur avec avatar
  et role, adresse IP conservee a l ecran (choix Dom)
- filtres par famille avec effectifs (Comptes / Acces / Affiliations / Sauvegardes /
  Configuration / Services), recherche libre a droite, Rafraichir + CSV en tete,
  pied de panneau avec pagination, plafond et duree de conservation
- details imbriques rendus lisibles (« Categorie · Structure ») au lieu de
  [object Object] ; « avant → apres » pour les changements de role et d affiliation
- nom de l acteur resolu tant que son compte existe (avatar a initiales)
- dayLabel / TIME_FMT exportes du journal RGPD ; CSS .jr-* + .rg-ico.is-ok
- guide : section « Journal des actions privilegiees », documents regeneres

Co-Authored-By: Claude Fable 5.1 <noreply@anthropic.com>
</commit_message>
<xml_diff>
--- a/docs/Guide-utilisation.docx
+++ b/docs/Guide-utilisation.docx
@@ -4288,6 +4288,43 @@
           <w:szCs w:val="18"/>
         </w:rPr>
         <w:t xml:space="preserve">Figure 15 — RGPD : conservation des données et journal d'audit</w:t>
+      </w:r>
+    </w:p>
+    <w:p>
+      <w:pPr>
+        <w:pStyle w:val="Heading2"/>
+        <w:spacing w:after="160" w:before="240"/>
+      </w:pPr>
+      <w:r>
+        <w:t xml:space="preserve">Journal des actions privilégiées</w:t>
+      </w:r>
+    </w:p>
+    <w:p>
+      <w:pPr>
+        <w:spacing w:after="160"/>
+      </w:pPr>
+      <w:r>
+        <w:t xml:space="preserve">L'onglet </w:t>
+      </w:r>
+      <w:r>
+        <w:rPr>
+          <w:b/>
+          <w:bCs/>
+        </w:rPr>
+        <w:t xml:space="preserve">Journal</w:t>
+      </w:r>
+      <w:r>
+        <w:t xml:space="preserve"> retrace les actes d'exploitation sensibles : changements de rôle, déconnexions forcées, réinitialisations de double authentification, opérations sur les sauvegardes (création, restauration, téléchargement, suppression), modification de la configuration SMTP, suppression d'un service, changement de catégorie ou de structure par un usager depuis « Mon compte ». Il se lit en frise chronologique par jour : heure, pictogramme teinté selon la portée de l'acte (rouge pour les destructions et restaurations, orange pour ce qui touche aux accès), libellé avec son détail (valeur avant et après pour un changement, nom du fichier pour une sauvegarde), acteur avec son rôle, adresse IP vue par le serveur. Les pastilles filtrent par famille (Comptes, Accès, Affiliations, Sauvegardes, Configuration, Services) et le champ de recherche affine sur l'acteur, la cible, le détail ou l'IP ; </w:t>
+      </w:r>
+      <w:r>
+        <w:rPr>
+          <w:b/>
+          <w:bCs/>
+        </w:rPr>
+        <w:t xml:space="preserve">« CSV »</w:t>
+      </w:r>
+      <w:r>
+        <w:t xml:space="preserve"> exporte la sélection. Les 2 000 entrées les plus récentes sont affichées ; le journal est conservé deux ans puis purgé par la tâche de rétention. Les exports et anonymisations RGPD, eux, restent dans l'onglet RGPD.</w:t>
       </w:r>
     </w:p>
     <w:p>

</xml_diff>

<commit_message>
style(editions): refonte de l onglet Editions d un service en cartes avec chiffres du jour
- cartes groupees par usage (sur l exercice / par semaine ou periode / liste d attente :
  etat du jour et exercice), pictogramme SVG teinte, description, chiffre du jour
  (inscrits, creneaux ouverts, reservations, seances de la semaine, seances a pointer sur
  30 jours ; en attente, demi-journee la plus demandee, adresses, closes, places et delai
  moyen), formats PDF / CSV en pastilles, telechargement CSV direct et « Ouvrir » reveles
  au survol
- selecteur d exercice en tete de page (ExerciceNav) propage dans les liens des cartes et
  des exports ; l en-tete « Editions — service » en doublon disparait
- glyphes Printer / ListDetails / ChartBar / Target ; CSS .ed-* + .rg-ico.is-purple
- guide : paragraphe Editions mis a jour, documents regeneres

Co-Authored-By: Claude Fable 5.1 <noreply@anthropic.com>
</commit_message>
<xml_diff>
--- a/docs/Guide-utilisation.docx
+++ b/docs/Guide-utilisation.docx
@@ -2272,7 +2272,17 @@
         <w:t xml:space="preserve">Éditions</w:t>
       </w:r>
       <w:r>
-        <w:t xml:space="preserve"> présente la </w:t>
+        <w:t xml:space="preserve"> présente ses éditions en cartes groupées par usage — « Sur l'exercice » pour les listes complètes, « Par semaine ou par période » pour ce qui s'imprime avant les séances — avec, sur chaque carte, un chiffre du jour (inscrits, créneaux, réservations, séances de la semaine, séances restant à pointer sur trente jours), les formats disponibles et, au survol, le téléchargement direct du CSV et </w:t>
+      </w:r>
+      <w:r>
+        <w:rPr>
+          <w:b/>
+          <w:bCs/>
+        </w:rPr>
+        <w:t xml:space="preserve">« Ouvrir »</w:t>
+      </w:r>
+      <w:r>
+        <w:t xml:space="preserve">. Le sélecteur d'exercice en tête de page pré-règle les écrans ouverts depuis les cartes. On y trouve la </w:t>
       </w:r>
       <w:r>
         <w:rPr>
@@ -2370,7 +2380,7 @@
         <w:t xml:space="preserve">liste d'attente</w:t>
       </w:r>
       <w:r>
-        <w:t xml:space="preserve">, un second panneau propose cinq éditions (PDF et CSV) : la </w:t>
+        <w:t xml:space="preserve">, un second panneau propose cinq éditions (PDF et CSV), en deux groupes — l'état du jour (avec le nombre d'inscrits en attente et la demi-journée la plus demandée) et l'exercice (inscriptions closes, placements et délai moyen) : la </w:t>
       </w:r>
       <w:r>
         <w:rPr>

</xml_diff>

<commit_message>
style(exercice): refonte du panneau Changement d exercice (tuiles de chiffres, cartes creation / retour arriere, interrupteurs, historique)
- Trois tuiles : dernier exercice (bornes, affiche ou non), periodes a reconduire,
  creneaux a recreer (recurrents + lots multi-ponctuels) — nouveaux compteurs serveur.
- Deux cartes toujours visibles a la place des cases a cocher qui depliaient un bloc ;
  options en interrupteurs avec le nombre concerne en pastille ; sans les periodes le
  bouton se grise. Retour arriere : bande rouge / orange, case « J ai compris ».
- Modales de confirmation au style des referentiels, plus d emoji.
- Ligne « Derniere bascule … par … » : l auteur est memorise dans le CycleEvent.
- Guide mis a jour.

Co-Authored-By: Claude Fable 5.1 <noreply@anthropic.com>
</commit_message>
<xml_diff>
--- a/docs/Guide-utilisation.docx
+++ b/docs/Guide-utilisation.docx
@@ -3400,7 +3400,27 @@
         <w:t xml:space="preserve">dates décalées</w:t>
       </w:r>
       <w:r>
-        <w:t xml:space="preserve"> à partir de l'exercice précédent ; les exercices antérieurs restent consultables.</w:t>
+        <w:t xml:space="preserve"> à partir de l'exercice précédent ; les exercices antérieurs restent consultables. Le panneau s'ouvre sur trois tuiles qui annoncent ce que la bascule reconduirait : le dernier exercice (bornes, affiché ou non aux utilisateurs), les périodes à reconduire, les créneaux à recréer (récurrents et lots multi-ponctuels). En dessous, deux cartes côte à côte. </w:t>
+      </w:r>
+      <w:r>
+        <w:rPr>
+          <w:b/>
+          <w:bCs/>
+        </w:rPr>
+        <w:t xml:space="preserve">Créer l'exercice</w:t>
+      </w:r>
+      <w:r>
+        <w:t xml:space="preserve"> propose trois interrupteurs — périodes à l'identique, créneaux récurrents, lots multi-ponctuels — chacun avec le nombre concerné en pastille ; sans les périodes, rien n'est reconduit et le bouton se grise. </w:t>
+      </w:r>
+      <w:r>
+        <w:rPr>
+          <w:b/>
+          <w:bCs/>
+        </w:rPr>
+        <w:t xml:space="preserve">Revenir à l'exercice précédent</w:t>
+      </w:r>
+      <w:r>
+        <w:t xml:space="preserve"> n'apparaît que si la dernière bascule est annulable : une bande rouge compte les réservations qui seraient supprimées (orange s'il n'y en a aucune) et une case « J'ai compris » déverrouille le bouton. Les deux actions demandent une confirmation en modale, et une ligne en pied rappelle la date et l'auteur de la dernière bascule.</w:t>
       </w:r>
     </w:p>
     <w:p>

</xml_diff>

<commit_message>
feat(editions): bouton Copier sur les adresses e-mail des inscrits en liste d attente
Edition « Adresses des inscrits » : l intertitre « Adresses e-mail à copier » porte un
bouton qui met la liste (separee par « ; ») dans le presse-papiers, avec un retour
« Copié » deux secondes ; la zone de texte se selectionne entierement au focus.
Guide, aide integree et Word mis a jour.

Co-Authored-By: Claude Fable 5.1 <noreply@anthropic.com>
</commit_message>
<xml_diff>
--- a/docs/Guide-utilisation.docx
+++ b/docs/Guide-utilisation.docx
@@ -2430,7 +2430,17 @@
         <w:t xml:space="preserve">adresses des inscrits</w:t>
       </w:r>
       <w:r>
-        <w:t xml:space="preserve"> (coordonnées du jour, avec les e-mails prêts à coller dans le champ « Cci » d'une messagerie). Les trois premières décrivent l'état du jour ; l'historique et les placements se lisent par exercice, à la date d'inscription.</w:t>
+        <w:t xml:space="preserve"> (coordonnées du jour, avec les e-mails prêts à coller dans le champ « Cci » d'une messagerie : le bouton </w:t>
+      </w:r>
+      <w:r>
+        <w:rPr>
+          <w:b/>
+          <w:bCs/>
+        </w:rPr>
+        <w:t xml:space="preserve">« Copier »</w:t>
+      </w:r>
+      <w:r>
+        <w:t xml:space="preserve"> les met dans le presse-papiers). Les trois premières décrivent l'état du jour ; l'historique et les placements se lisent par exercice, à la date d'inscription.</w:t>
       </w:r>
     </w:p>
     <w:p>

</xml_diff>